<commit_message>
feat(gold): add Gold layer with 5 feature tables, BigQuery load, process documentation, and updated Q&A questions
Gold layer (src/gold/):
- feat_prestador_perfil: technical profile per provider (6,514 rows)
- feat_prestador_performance: operational KPIs 2025 (6,576 rows)
- feat_prestador: master offer table — left join of above (6,514 rows)
- feat_empresa: demand features per company (2,175,102 rows)
- clustering_input: 22-feature ML-ready matrix (5,162 active providers)

Infrastructure / config:
- src/config.py: add BQ Gold dataset constant and GCS paths for Gold tables

Scripts:
- scripts/load_to_bigquery_gold.py: batch load all 5 Gold tables (WRITE_TRUNCATE)

Docs:
- docs/PROCESO_GOLD.md: Gold layer decision log with 7 unconfirmed assumptions (Q17-Q23)
- docs/PREGUNTAS_QA_SURA.md: expanded with Q17-Q29 across 3 project phases
- docs/DESCRIPCION_DATOS.md: updated data dictionary
- docs/Diagnostico_y_Analisis_SURA_2026: updated diagnosis document
</commit_message>
<xml_diff>
--- a/docs/Diagnostico_y_Analisis_SURA_2026.docx
+++ b/docs/Diagnostico_y_Analisis_SURA_2026.docx
@@ -883,7 +883,7 @@
         <w:rPr>
           <w:color w:val="333333"/>
         </w:rPr>
-        <w:t>órdenes de compra (607.331 registros), programaciones 2025 (1.542.709), detalle de empresas (2.175.102) y catálogo de prestadores (663.503 habilitaciones).</w:t>
+        <w:t>órdenes de compra (607.331 registros), programaciones 2025 (1.542.709), detalle de empresas (2.175.102) y catálogo de prestadores (2.811.857 habilitaciones).</w:t>
       </w:r>
     </w:p>
     <w:p>
@@ -1128,7 +1128,7 @@
         <w:rPr>
           <w:color w:val="333333"/>
         </w:rPr>
-        <w:t>22,</w:t>
+        <w:t>28,</w:t>
       </w:r>
       <w:r>
         <w:rPr>
@@ -1141,7 +1141,7 @@
         <w:rPr>
           <w:color w:val="333333"/>
         </w:rPr>
-        <w:t>frente a una media de 88,7 y un máximo de 141.778. El índice de Gini</w:t>
+        <w:t>frente a una media de 96,5 y un máximo de 141.778. El índice de Gini</w:t>
       </w:r>
       <w:r>
         <w:rPr>
@@ -1165,7 +1165,7 @@
         <w:rPr>
           <w:color w:val="333333"/>
         </w:rPr>
-        <w:t xml:space="preserve"> 0,773, y los 2 prestadores más cargados concentran el 34,4% de todas las órdenes.</w:t>
+        <w:t xml:space="preserve"> 0,757, y los 2 prestadores más cargados concentran el 34,4% de todas las órdenes.</w:t>
       </w:r>
     </w:p>
     <w:p>
@@ -1186,7 +1186,7 @@
           <w:bCs/>
           <w:color w:val="4BACC6" w:themeColor="accent5"/>
         </w:rPr>
-        <w:t>Esto significa que la mitad de los prestadores tiene 22 órdenes o menos, pero hay dos prestadores que, entre los dos, acumulan más de un tercio de todas las órdenes del sistema.</w:t>
+        <w:t>Esto significa que la mitad de los prestadores tiene 28 órdenes o menos, pero hay dos prestadores que, entre los dos, acumulan más de un tercio de todas las órdenes del sistema.</w:t>
       </w:r>
       <w:r>
         <w:rPr>
@@ -1478,7 +1478,7 @@
         <w:rPr>
           <w:color w:val="333333"/>
         </w:rPr>
-        <w:t>105</w:t>
+        <w:t>241</w:t>
       </w:r>
       <w:r>
         <w:rPr>
@@ -1556,7 +1556,7 @@
         <w:rPr>
           <w:color w:val="333333"/>
         </w:rPr>
-        <w:t>1.298 municipios. Hay</w:t>
+        <w:t>906 municipios. Hay</w:t>
       </w:r>
       <w:r>
         <w:rPr>
@@ -1569,7 +1569,7 @@
         <w:rPr>
           <w:color w:val="333333"/>
         </w:rPr>
-        <w:t>1.193 municipios de</w:t>
+        <w:t>665 municipios de</w:t>
       </w:r>
       <w:r>
         <w:rPr>
@@ -2510,7 +2510,7 @@
                 <w:color w:val="333333"/>
                 <w:sz w:val="20"/>
               </w:rPr>
-              <w:t>663.503</w:t>
+              <w:t>2.811.857</w:t>
             </w:r>
             <w:r>
               <w:rPr>
@@ -4455,7 +4455,7 @@
                 <w:spacing w:val="-2"/>
                 <w:sz w:val="20"/>
               </w:rPr>
-              <w:t>440.311</w:t>
+              <w:t>440.165</w:t>
             </w:r>
           </w:p>
         </w:tc>
@@ -4527,7 +4527,7 @@
                 <w:spacing w:val="-2"/>
                 <w:sz w:val="20"/>
               </w:rPr>
-              <w:t>143.309</w:t>
+              <w:t>144.135</w:t>
             </w:r>
           </w:p>
         </w:tc>
@@ -4549,7 +4549,7 @@
                 <w:spacing w:val="-2"/>
                 <w:sz w:val="20"/>
               </w:rPr>
-              <w:t>23,6%</w:t>
+              <w:t>23,7%</w:t>
             </w:r>
           </w:p>
         </w:tc>
@@ -4973,7 +4973,7 @@
         <w:rPr>
           <w:color w:val="333333"/>
         </w:rPr>
-        <w:t>La distribución de órdenes por prestador (6.848 prestadores con al menos una orden) revela una desigualdad crítica:</w:t>
+        <w:t>La distribución de órdenes por prestador (6.288 prestadores con al menos una orden) revela una desigualdad crítica:</w:t>
       </w:r>
     </w:p>
     <w:p>
@@ -5105,7 +5105,7 @@
                 <w:color w:val="333333"/>
                 <w:sz w:val="20"/>
               </w:rPr>
-              <w:t>88,7</w:t>
+              <w:t>96,5</w:t>
             </w:r>
             <w:r>
               <w:rPr>
@@ -5169,7 +5169,7 @@
                 <w:color w:val="333333"/>
                 <w:sz w:val="20"/>
               </w:rPr>
-              <w:t>22</w:t>
+              <w:t>28</w:t>
             </w:r>
             <w:r>
               <w:rPr>
@@ -5251,7 +5251,7 @@
                 <w:spacing w:val="-2"/>
                 <w:sz w:val="20"/>
               </w:rPr>
-              <w:t>1.897,8</w:t>
+              <w:t>1.980,4</w:t>
             </w:r>
           </w:p>
         </w:tc>
@@ -5314,7 +5314,7 @@
                 <w:color w:val="333333"/>
                 <w:sz w:val="20"/>
               </w:rPr>
-              <w:t>5</w:t>
+              <w:t>8</w:t>
             </w:r>
             <w:r>
               <w:rPr>
@@ -5387,7 +5387,7 @@
                 <w:color w:val="333333"/>
                 <w:sz w:val="20"/>
               </w:rPr>
-              <w:t>78</w:t>
+              <w:t>87</w:t>
             </w:r>
             <w:r>
               <w:rPr>
@@ -5546,7 +5546,7 @@
                 <w:spacing w:val="-2"/>
                 <w:sz w:val="20"/>
               </w:rPr>
-              <w:t>0,773</w:t>
+              <w:t>0,757</w:t>
             </w:r>
           </w:p>
         </w:tc>
@@ -5766,7 +5766,7 @@
                 <w:spacing w:val="-5"/>
                 <w:sz w:val="20"/>
               </w:rPr>
-              <w:t>12</w:t>
+              <w:t>13</w:t>
             </w:r>
           </w:p>
         </w:tc>
@@ -7765,7 +7765,7 @@
         <w:rPr>
           <w:color w:val="333333"/>
         </w:rPr>
-        <w:t>A nivel de prestador, 1.006 presentan tasa de cancelación superior al 30%, y 120 superan el</w:t>
+        <w:t>A nivel de prestador, 1.165 presentan tasa de cancelación superior al 30%, y 169 superan el</w:t>
       </w:r>
       <w:r>
         <w:rPr>
@@ -9075,7 +9075,7 @@
                 <w:spacing w:val="-2"/>
                 <w:sz w:val="20"/>
               </w:rPr>
-              <w:t>120.538</w:t>
+              <w:t>130.453</w:t>
             </w:r>
           </w:p>
         </w:tc>
@@ -9097,7 +9097,7 @@
                 <w:spacing w:val="-2"/>
                 <w:sz w:val="20"/>
               </w:rPr>
-              <w:t>19,9%</w:t>
+              <w:t>21,5%</w:t>
             </w:r>
           </w:p>
         </w:tc>
@@ -9250,7 +9250,7 @@
                 <w:spacing w:val="-2"/>
                 <w:sz w:val="20"/>
               </w:rPr>
-              <w:t>90.298</w:t>
+              <w:t>95.434</w:t>
             </w:r>
           </w:p>
         </w:tc>
@@ -9273,7 +9273,7 @@
                 <w:spacing w:val="-2"/>
                 <w:sz w:val="20"/>
               </w:rPr>
-              <w:t>14,9%</w:t>
+              <w:t>15,7%</w:t>
             </w:r>
           </w:p>
         </w:tc>
@@ -9337,7 +9337,7 @@
                 <w:spacing w:val="-2"/>
                 <w:sz w:val="20"/>
               </w:rPr>
-              <w:t>81.214</w:t>
+              <w:t>91.759</w:t>
             </w:r>
           </w:p>
         </w:tc>
@@ -9359,7 +9359,7 @@
                 <w:spacing w:val="-2"/>
                 <w:sz w:val="20"/>
               </w:rPr>
-              <w:t>13,4%</w:t>
+              <w:t>15,1%</w:t>
             </w:r>
           </w:p>
         </w:tc>
@@ -9586,7 +9586,7 @@
                 <w:spacing w:val="-2"/>
                 <w:sz w:val="20"/>
               </w:rPr>
-              <w:t>34.325</w:t>
+              <w:t>35.227</w:t>
             </w:r>
           </w:p>
         </w:tc>
@@ -9608,7 +9608,7 @@
                 <w:spacing w:val="-4"/>
                 <w:sz w:val="20"/>
               </w:rPr>
-              <w:t>5,7%</w:t>
+              <w:t>5,8%</w:t>
             </w:r>
           </w:p>
         </w:tc>
@@ -9674,7 +9674,7 @@
                 <w:spacing w:val="-2"/>
                 <w:sz w:val="20"/>
               </w:rPr>
-              <w:t>29.494</w:t>
+              <w:t>29.832</w:t>
             </w:r>
           </w:p>
         </w:tc>
@@ -10646,7 +10646,7 @@
         <w:rPr>
           <w:color w:val="333333"/>
         </w:rPr>
-        <w:t>663.503</w:t>
+        <w:t>2.811.857</w:t>
       </w:r>
       <w:r>
         <w:rPr>
@@ -10960,7 +10960,7 @@
                 <w:spacing w:val="-2"/>
                 <w:sz w:val="20"/>
               </w:rPr>
-              <w:t>462.557</w:t>
+              <w:t>1.289.000</w:t>
             </w:r>
           </w:p>
         </w:tc>
@@ -10982,7 +10982,7 @@
                 <w:spacing w:val="-2"/>
                 <w:sz w:val="20"/>
               </w:rPr>
-              <w:t>69,7%</w:t>
+              <w:t>45,8%</w:t>
             </w:r>
           </w:p>
         </w:tc>
@@ -11031,7 +11031,7 @@
                 <w:spacing w:val="-2"/>
                 <w:sz w:val="20"/>
               </w:rPr>
-              <w:t>136.078</w:t>
+              <w:t>1.129.772</w:t>
             </w:r>
           </w:p>
         </w:tc>
@@ -11053,7 +11053,7 @@
                 <w:spacing w:val="-2"/>
                 <w:sz w:val="20"/>
               </w:rPr>
-              <w:t>20,5%</w:t>
+              <w:t>40,2%</w:t>
             </w:r>
           </w:p>
         </w:tc>
@@ -11104,7 +11104,7 @@
                 <w:spacing w:val="-2"/>
                 <w:sz w:val="20"/>
               </w:rPr>
-              <w:t>42.055</w:t>
+              <w:t>207.802</w:t>
             </w:r>
           </w:p>
         </w:tc>
@@ -11127,7 +11127,7 @@
                 <w:spacing w:val="-4"/>
                 <w:sz w:val="20"/>
               </w:rPr>
-              <w:t>6,3%</w:t>
+              <w:t>7,4%</w:t>
             </w:r>
           </w:p>
         </w:tc>
@@ -11176,7 +11176,7 @@
                 <w:spacing w:val="-2"/>
                 <w:sz w:val="20"/>
               </w:rPr>
-              <w:t>22.813</w:t>
+              <w:t>181.068</w:t>
             </w:r>
           </w:p>
         </w:tc>
@@ -11198,7 +11198,7 @@
                 <w:spacing w:val="-4"/>
                 <w:sz w:val="20"/>
               </w:rPr>
-              <w:t>3,4%</w:t>
+              <w:t>6,4%</w:t>
             </w:r>
           </w:p>
         </w:tc>
@@ -11395,7 +11395,7 @@
         <w:rPr>
           <w:color w:val="4BACC6" w:themeColor="accent5"/>
         </w:rPr>
-        <w:t>4</w:t>
+        <w:t>8</w:t>
       </w:r>
       <w:r>
         <w:rPr>
@@ -11709,7 +11709,7 @@
                 <w:spacing w:val="-2"/>
                 <w:sz w:val="20"/>
               </w:rPr>
-              <w:t>203.997</w:t>
+              <w:t>204.004</w:t>
             </w:r>
           </w:p>
         </w:tc>
@@ -11835,7 +11835,7 @@
                 <w:spacing w:val="-2"/>
                 <w:sz w:val="20"/>
               </w:rPr>
-              <w:t>173.622</w:t>
+              <w:t>489.205</w:t>
             </w:r>
           </w:p>
         </w:tc>
@@ -11914,7 +11914,7 @@
                 <w:spacing w:val="-2"/>
                 <w:sz w:val="20"/>
               </w:rPr>
-              <w:t>142.954</w:t>
+              <w:t>1.788.603</w:t>
             </w:r>
           </w:p>
         </w:tc>
@@ -11993,7 +11993,7 @@
                 <w:spacing w:val="-2"/>
                 <w:sz w:val="20"/>
               </w:rPr>
-              <w:t>103.790</w:t>
+              <w:t>278.872</w:t>
             </w:r>
           </w:p>
         </w:tc>
@@ -12089,7 +12089,7 @@
                 <w:spacing w:val="-2"/>
                 <w:sz w:val="20"/>
               </w:rPr>
-              <w:t>25.053</w:t>
+              <w:t>25.972</w:t>
             </w:r>
           </w:p>
         </w:tc>
@@ -12550,7 +12550,7 @@
                 <w:spacing w:val="-5"/>
                 <w:sz w:val="20"/>
               </w:rPr>
-              <w:t>157</w:t>
+              <w:t>183,9</w:t>
             </w:r>
           </w:p>
         </w:tc>
@@ -12572,7 +12572,7 @@
                 <w:spacing w:val="-5"/>
                 <w:sz w:val="20"/>
               </w:rPr>
-              <w:t>169</w:t>
+              <w:t>220</w:t>
             </w:r>
           </w:p>
         </w:tc>
@@ -12651,7 +12651,7 @@
                 <w:spacing w:val="-5"/>
                 <w:sz w:val="20"/>
               </w:rPr>
-              <w:t>467</w:t>
+              <w:t>431,7</w:t>
             </w:r>
           </w:p>
         </w:tc>
@@ -12673,7 +12673,7 @@
                 <w:spacing w:val="-5"/>
                 <w:sz w:val="20"/>
               </w:rPr>
-              <w:t>422</w:t>
+              <w:t>404</w:t>
             </w:r>
           </w:p>
         </w:tc>
@@ -12774,7 +12774,7 @@
         <w:spacing w:before="147" w:line="276" w:lineRule="auto"/>
       </w:pPr>
       <w:r>
-        <w:t xml:space="preserve">Cada prestador tiene, en promedio, 467 tareas diferentes que puede realizar. Esto refleja una red versátil. Sin embargo, si el sistema de asignación no aprovecha esta versatilidad y asigna </w:t>
+        <w:t xml:space="preserve">Cada prestador tiene, en promedio, 431,7 tareas diferentes que puede realizar. Esto refleja una red versátil. Sin embargo, si el sistema de asignación no aprovecha esta versatilidad y asigna </w:t>
       </w:r>
       <w:r>
         <w:t>de manera repetida</w:t>
@@ -12987,7 +12987,7 @@
                 <w:spacing w:val="-5"/>
                 <w:sz w:val="20"/>
               </w:rPr>
-              <w:t>105</w:t>
+              <w:t>241</w:t>
             </w:r>
           </w:p>
         </w:tc>
@@ -13434,7 +13434,7 @@
         <w:rPr>
           <w:color w:val="333333"/>
         </w:rPr>
-        <w:t>105</w:t>
+        <w:t>241</w:t>
       </w:r>
       <w:r>
         <w:rPr>
@@ -14255,7 +14255,7 @@
                 <w:color w:val="333333"/>
                 <w:sz w:val="20"/>
               </w:rPr>
-              <w:t>Gini = 0,773. Top 2 prestadores = 34,4%</w:t>
+              <w:t>Gini = 0,757. Top 2 prestadores = 34,4%</w:t>
             </w:r>
             <w:r>
               <w:rPr>
@@ -14330,7 +14330,7 @@
                 <w:color w:val="333333"/>
                 <w:sz w:val="20"/>
               </w:rPr>
-              <w:t>22</w:t>
+              <w:t>28</w:t>
             </w:r>
             <w:r>
               <w:rPr>
@@ -14716,7 +14716,7 @@
                 <w:color w:val="333333"/>
                 <w:sz w:val="20"/>
               </w:rPr>
-              <w:t>105</w:t>
+              <w:t>241</w:t>
             </w:r>
             <w:r>
               <w:rPr>
@@ -16019,7 +16019,7 @@
         <w:rPr>
           <w:color w:val="4BACC6" w:themeColor="accent5"/>
         </w:rPr>
-        <w:t>El sistema actual de asignación centralizada presenta cuatro problemas estructurales verificados en los datos: concentración extrema de carga (Gini = 0,773), alta tasa de cancelación por causas internas (14,9%, 79% internas), brecha geográfica (105 vs 1.298 municipios) y falta de segmentación (13,2% sin ruta).</w:t>
+        <w:t>El sistema actual de asignación centralizada presenta cuatro problemas estructurales verificados en los datos: concentración extrema de carga (Gini = 0,757), alta tasa de cancelación por causas internas (14,9%, 79% internas), brecha geográfica (241 vs 906 municipios) y falta de segmentación (13,2% sin ruta).</w:t>
       </w:r>
     </w:p>
     <w:p>
@@ -16048,7 +16048,7 @@
         <w:rPr>
           <w:color w:val="333333"/>
         </w:rPr>
-        <w:t>Los datos disponibles (607.331 órdenes, 1.542.709 programaciones, 663.503 habilitaciones y 2.175.102 empresas) son suficientes para construir un modelo de clústeres que agrupe prestadores por geografía, especialización, capacidad y desempeño, y lo cruce con la segmentación de la demanda empresarial.</w:t>
+        <w:t>Los datos disponibles (607.331 órdenes, 1.542.709 programaciones, 2.811.857 habilitaciones y 2.175.102 empresas) son suficientes para construir un modelo de clústeres que agrupe prestadores por geografía, especialización, capacidad y desempeño, y lo cruce con la segmentación de la demanda empresarial.</w:t>
       </w:r>
     </w:p>
     <w:p>

</xml_diff>